<commit_message>
docs: Web UI in HLD, Installation, STD, README, Limitations and AI usage
- HLD: Web UI in scope, services/communication tables, 4.3 component design, deployment; draw.io
  pages 1 and 6 include the UI
- Installation: UI dev server, verify with the UI, prebuilt path without npm, 6.8 npm/UI errors
- STD: 7.6 Web UI cases UI-001..UI-021, R19, MT-12 (passed), defect D-08; totals 332 / 461
- Limitations: 2.7 Web UI (UI-1..UI-6); SE-1 notes the rolled-back implementation
- AI usage: prompts 16-17, items 15-17 (auth rolled back, Angular 17, UI build); decisions D28-D29

Co-Authored-By: Claude Opus 5.5 <noreply@anthropic.com>
</commit_message>
<xml_diff>
--- a/docs/ai-usage/TA9-AI-Usage.docx
+++ b/docs/ai-usage/TA9-AI-Usage.docx
@@ -302,7 +302,7 @@
                 <w:sz w:val="18"/>
                 <w:szCs w:val="18"/>
               </w:rPr>
-              <w:t xml:space="preserve">14 AI outputs were changed, rejected or corrected</w:t>
+              <w:t xml:space="preserve">17 AI outputs were changed, rejected or corrected</w:t>
             </w:r>
             <w:r>
               <w:rPr>
@@ -368,7 +368,7 @@
                 <w:sz w:val="18"/>
                 <w:szCs w:val="18"/>
               </w:rPr>
-              <w:t xml:space="preserve">31 commits in small steps · 311 test methods / 440 executions, all passing · defect log D-01 to D-07 in the STD · decision log D1–D27</w:t>
+              <w:t xml:space="preserve">40 commits in small steps · 311 service test methods / 440 executions plus 21 Web UI tests, all passing · defect log D-01 to D-08 in the STD · decision log D1–D29</w:t>
             </w:r>
           </w:p>
         </w:tc>
@@ -877,7 +877,7 @@
                 <w:sz w:val="18"/>
                 <w:szCs w:val="18"/>
               </w:rPr>
-              <w:t xml:space="preserve">Essentially all source code (~5,600 lines of C#), tests (~6,200 lines), Docker and compose files, scripts, the Postman collection, the documents, the diagrams and the small document-generation tools</w:t>
+              <w:t xml:space="preserve">Essentially all source code (~5,600 lines of C#, ~1,000 lines of Angular/TypeScript), tests (~6,200 lines of C#, ~300 of TypeScript), Docker and compose files, scripts, the Postman collection, the documents, the diagrams and the small document-generation tools</w:t>
             </w:r>
           </w:p>
         </w:tc>
@@ -1184,6 +1184,62 @@
                 <w:sz w:val="18"/>
                 <w:szCs w:val="18"/>
               </w:rPr>
+              <w:t xml:space="preserve">Angular CLI 17 · npm · Karma / Jasmine · nginx</w:t>
+            </w:r>
+          </w:p>
+        </w:tc>
+        <w:tc>
+          <w:tcPr>
+            <w:tcW w:type="dxa" w:w="4819"/>
+            <w:tcBorders>
+              <w:top w:val="single" w:color="BFBFBF" w:sz="4"/>
+              <w:left w:val="single" w:color="BFBFBF" w:sz="4"/>
+              <w:bottom w:val="single" w:color="BFBFBF" w:sz="4"/>
+              <w:right w:val="single" w:color="BFBFBF" w:sz="4"/>
+            </w:tcBorders>
+            <w:tcMar>
+              <w:top w:type="dxa" w:w="60"/>
+              <w:left w:type="dxa" w:w="100"/>
+              <w:bottom w:type="dxa" w:w="60"/>
+              <w:right w:type="dxa" w:w="100"/>
+            </w:tcMar>
+          </w:tcPr>
+          <w:p>
+            <w:r>
+              <w:rPr>
+                <w:rFonts w:ascii="Calibri" w:cs="Calibri" w:eastAsia="Calibri" w:hAnsi="Calibri"/>
+                <w:sz w:val="18"/>
+                <w:szCs w:val="18"/>
+              </w:rPr>
+              <w:t xml:space="preserve">The optional Web UI: scaffolded with the official CLI, then written by the AI; tested in headless Chrome</w:t>
+            </w:r>
+          </w:p>
+        </w:tc>
+      </w:tr>
+      <w:tr>
+        <w:tc>
+          <w:tcPr>
+            <w:tcW w:type="dxa" w:w="4819"/>
+            <w:tcBorders>
+              <w:top w:val="single" w:color="BFBFBF" w:sz="4"/>
+              <w:left w:val="single" w:color="BFBFBF" w:sz="4"/>
+              <w:bottom w:val="single" w:color="BFBFBF" w:sz="4"/>
+              <w:right w:val="single" w:color="BFBFBF" w:sz="4"/>
+            </w:tcBorders>
+            <w:tcMar>
+              <w:top w:type="dxa" w:w="60"/>
+              <w:left w:type="dxa" w:w="100"/>
+              <w:bottom w:type="dxa" w:w="60"/>
+              <w:right w:type="dxa" w:w="100"/>
+            </w:tcMar>
+          </w:tcPr>
+          <w:p>
+            <w:r>
+              <w:rPr>
+                <w:rFonts w:ascii="Calibri" w:cs="Calibri" w:eastAsia="Calibri" w:hAnsi="Calibri"/>
+                <w:sz w:val="18"/>
+                <w:szCs w:val="18"/>
+              </w:rPr>
               <w:t xml:space="preserve">draw.io (XML generated by the AI)</w:t>
             </w:r>
           </w:p>
@@ -1228,7 +1284,7 @@
                 <w:sz w:val="18"/>
                 <w:szCs w:val="18"/>
               </w:rPr>
-              <w:t xml:space="preserve">, 12 pages. Rendered to PNG by a small headless-browser script (</w:t>
+              <w:t xml:space="preserve">, 12+ pages. Rendered to PNG by a small headless-browser script (</w:t>
             </w:r>
             <w:r>
               <w:rPr>
@@ -2180,6 +2236,58 @@
         <w:rPr>
           <w:rFonts w:ascii="Calibri" w:cs="Calibri" w:eastAsia="Calibri" w:hAnsi="Calibri"/>
         </w:rPr>
+        <w:t xml:space="preserve">A simple </w:t>
+      </w:r>
+      <w:r>
+        <w:rPr>
+          <w:rFonts w:ascii="Calibri" w:cs="Calibri" w:eastAsia="Calibri" w:hAnsi="Calibri"/>
+          <w:b/>
+          <w:bCs/>
+        </w:rPr>
+        <w:t xml:space="preserve">Angular 17</w:t>
+      </w:r>
+      <w:r>
+        <w:rPr>
+          <w:rFonts w:ascii="Calibri" w:cs="Calibri" w:eastAsia="Calibri" w:hAnsi="Calibri"/>
+        </w:rPr>
+        <w:t xml:space="preserve"> web UI (the AI recommended a newer version; I chose 17).</w:t>
+      </w:r>
+    </w:p>
+    <w:p>
+      <w:pPr>
+        <w:pStyle w:val="ListParagraph"/>
+        <w:numPr>
+          <w:ilvl w:val="0"/>
+          <w:numId w:val="2"/>
+        </w:numPr>
+      </w:pPr>
+      <w:r>
+        <w:rPr>
+          <w:rFonts w:ascii="Calibri" w:cs="Calibri" w:eastAsia="Calibri" w:hAnsi="Calibri"/>
+          <w:b/>
+          <w:bCs/>
+        </w:rPr>
+        <w:t xml:space="preserve">Rolling back authentication</w:t>
+      </w:r>
+      <w:r>
+        <w:rPr>
+          <w:rFonts w:ascii="Calibri" w:cs="Calibri" w:eastAsia="Calibri" w:hAnsi="Calibri"/>
+        </w:rPr>
+        <w:t xml:space="preserve"> after it was built (D29): simplicity for the reviewer over an optional feature.</w:t>
+      </w:r>
+    </w:p>
+    <w:p>
+      <w:pPr>
+        <w:pStyle w:val="ListParagraph"/>
+        <w:numPr>
+          <w:ilvl w:val="0"/>
+          <w:numId w:val="2"/>
+        </w:numPr>
+      </w:pPr>
+      <w:r>
+        <w:rPr>
+          <w:rFonts w:ascii="Calibri" w:cs="Calibri" w:eastAsia="Calibri" w:hAnsi="Calibri"/>
+        </w:rPr>
         <w:t xml:space="preserve">The documentation set: HLD with four diagram types, an Installation Guide with an errors chapter, an STD, a topic document per assignment section with a test chapter linked to the STD.</w:t>
       </w:r>
     </w:p>
@@ -2903,6 +3011,116 @@
                 <w:szCs w:val="18"/>
               </w:rPr>
               <w:t xml:space="preserve">33 dedicated tests, including the real host pipeline and real MongoDB</w:t>
+            </w:r>
+          </w:p>
+        </w:tc>
+      </w:tr>
+      <w:tr>
+        <w:tc>
+          <w:tcPr>
+            <w:tcW w:type="dxa" w:w="2920"/>
+            <w:tcBorders>
+              <w:top w:val="single" w:color="BFBFBF" w:sz="4"/>
+              <w:left w:val="single" w:color="BFBFBF" w:sz="4"/>
+              <w:bottom w:val="single" w:color="BFBFBF" w:sz="4"/>
+              <w:right w:val="single" w:color="BFBFBF" w:sz="4"/>
+            </w:tcBorders>
+            <w:tcMar>
+              <w:top w:type="dxa" w:w="60"/>
+              <w:left w:type="dxa" w:w="100"/>
+              <w:bottom w:type="dxa" w:w="60"/>
+              <w:right w:type="dxa" w:w="100"/>
+            </w:tcMar>
+          </w:tcPr>
+          <w:p>
+            <w:r>
+              <w:rPr>
+                <w:rFonts w:ascii="Calibri" w:cs="Calibri" w:eastAsia="Calibri" w:hAnsi="Calibri"/>
+                <w:sz w:val="18"/>
+                <w:szCs w:val="18"/>
+              </w:rPr>
+              <w:t xml:space="preserve">Web UI (Angular 17, nginx proxy, Docker)</w:t>
+            </w:r>
+          </w:p>
+        </w:tc>
+        <w:tc>
+          <w:tcPr>
+            <w:tcW w:type="dxa" w:w="876"/>
+            <w:tcBorders>
+              <w:top w:val="single" w:color="BFBFBF" w:sz="4"/>
+              <w:left w:val="single" w:color="BFBFBF" w:sz="4"/>
+              <w:bottom w:val="single" w:color="BFBFBF" w:sz="4"/>
+              <w:right w:val="single" w:color="BFBFBF" w:sz="4"/>
+            </w:tcBorders>
+            <w:tcMar>
+              <w:top w:type="dxa" w:w="60"/>
+              <w:left w:type="dxa" w:w="100"/>
+              <w:bottom w:type="dxa" w:w="60"/>
+              <w:right w:type="dxa" w:w="100"/>
+            </w:tcMar>
+          </w:tcPr>
+          <w:p>
+            <w:r>
+              <w:rPr>
+                <w:rFonts w:ascii="Calibri" w:cs="Calibri" w:eastAsia="Calibri" w:hAnsi="Calibri"/>
+                <w:sz w:val="18"/>
+                <w:szCs w:val="18"/>
+              </w:rPr>
+              <w:t xml:space="preserve">Yes</w:t>
+            </w:r>
+          </w:p>
+        </w:tc>
+        <w:tc>
+          <w:tcPr>
+            <w:tcW w:type="dxa" w:w="2920"/>
+            <w:tcBorders>
+              <w:top w:val="single" w:color="BFBFBF" w:sz="4"/>
+              <w:left w:val="single" w:color="BFBFBF" w:sz="4"/>
+              <w:bottom w:val="single" w:color="BFBFBF" w:sz="4"/>
+              <w:right w:val="single" w:color="BFBFBF" w:sz="4"/>
+            </w:tcBorders>
+            <w:tcMar>
+              <w:top w:type="dxa" w:w="60"/>
+              <w:left w:type="dxa" w:w="100"/>
+              <w:bottom w:type="dxa" w:w="60"/>
+              <w:right w:type="dxa" w:w="100"/>
+            </w:tcMar>
+          </w:tcPr>
+          <w:p>
+            <w:r>
+              <w:rPr>
+                <w:rFonts w:ascii="Calibri" w:cs="Calibri" w:eastAsia="Calibri" w:hAnsi="Calibri"/>
+                <w:sz w:val="18"/>
+                <w:szCs w:val="18"/>
+              </w:rPr>
+              <w:t xml:space="preserve">Asked for it; chose the version, the screens and the deployment</w:t>
+            </w:r>
+          </w:p>
+        </w:tc>
+        <w:tc>
+          <w:tcPr>
+            <w:tcW w:type="dxa" w:w="2922"/>
+            <w:tcBorders>
+              <w:top w:val="single" w:color="BFBFBF" w:sz="4"/>
+              <w:left w:val="single" w:color="BFBFBF" w:sz="4"/>
+              <w:bottom w:val="single" w:color="BFBFBF" w:sz="4"/>
+              <w:right w:val="single" w:color="BFBFBF" w:sz="4"/>
+            </w:tcBorders>
+            <w:tcMar>
+              <w:top w:type="dxa" w:w="60"/>
+              <w:left w:type="dxa" w:w="100"/>
+              <w:bottom w:type="dxa" w:w="60"/>
+              <w:right w:type="dxa" w:w="100"/>
+            </w:tcMar>
+          </w:tcPr>
+          <w:p>
+            <w:r>
+              <w:rPr>
+                <w:rFonts w:ascii="Calibri" w:cs="Calibri" w:eastAsia="Calibri" w:hAnsi="Calibri"/>
+                <w:sz w:val="18"/>
+                <w:szCs w:val="18"/>
+              </w:rPr>
+              <w:t xml:space="preserve">21 component tests; manual walkthrough on Docker Desktop (MT-12)</w:t>
             </w:r>
           </w:p>
         </w:tc>
@@ -4930,6 +5148,172 @@
           </w:p>
         </w:tc>
       </w:tr>
+      <w:tr>
+        <w:tc>
+          <w:tcPr>
+            <w:tcW w:type="dxa" w:w="1482"/>
+            <w:tcBorders>
+              <w:top w:val="single" w:color="BFBFBF" w:sz="4"/>
+              <w:left w:val="single" w:color="BFBFBF" w:sz="4"/>
+              <w:bottom w:val="single" w:color="BFBFBF" w:sz="4"/>
+              <w:right w:val="single" w:color="BFBFBF" w:sz="4"/>
+            </w:tcBorders>
+            <w:tcMar>
+              <w:top w:type="dxa" w:w="60"/>
+              <w:left w:type="dxa" w:w="100"/>
+              <w:bottom w:type="dxa" w:w="60"/>
+              <w:right w:type="dxa" w:w="100"/>
+            </w:tcMar>
+          </w:tcPr>
+          <w:p>
+            <w:r>
+              <w:rPr>
+                <w:rFonts w:ascii="Calibri" w:cs="Calibri" w:eastAsia="Calibri" w:hAnsi="Calibri"/>
+                <w:sz w:val="18"/>
+                <w:szCs w:val="18"/>
+              </w:rPr>
+              <w:t xml:space="preserve">16</w:t>
+            </w:r>
+          </w:p>
+        </w:tc>
+        <w:tc>
+          <w:tcPr>
+            <w:tcW w:type="dxa" w:w="2224"/>
+            <w:tcBorders>
+              <w:top w:val="single" w:color="BFBFBF" w:sz="4"/>
+              <w:left w:val="single" w:color="BFBFBF" w:sz="4"/>
+              <w:bottom w:val="single" w:color="BFBFBF" w:sz="4"/>
+              <w:right w:val="single" w:color="BFBFBF" w:sz="4"/>
+            </w:tcBorders>
+            <w:tcMar>
+              <w:top w:type="dxa" w:w="60"/>
+              <w:left w:type="dxa" w:w="100"/>
+              <w:bottom w:type="dxa" w:w="60"/>
+              <w:right w:type="dxa" w:w="100"/>
+            </w:tcMar>
+          </w:tcPr>
+          <w:p>
+            <w:r>
+              <w:rPr>
+                <w:rFonts w:ascii="Calibri" w:cs="Calibri" w:eastAsia="Calibri" w:hAnsi="Calibri"/>
+                <w:sz w:val="18"/>
+                <w:szCs w:val="18"/>
+              </w:rPr>
+              <w:t xml:space="preserve">Scope</w:t>
+            </w:r>
+          </w:p>
+        </w:tc>
+        <w:tc>
+          <w:tcPr>
+            <w:tcW w:type="dxa" w:w="5932"/>
+            <w:tcBorders>
+              <w:top w:val="single" w:color="BFBFBF" w:sz="4"/>
+              <w:left w:val="single" w:color="BFBFBF" w:sz="4"/>
+              <w:bottom w:val="single" w:color="BFBFBF" w:sz="4"/>
+              <w:right w:val="single" w:color="BFBFBF" w:sz="4"/>
+            </w:tcBorders>
+            <w:tcMar>
+              <w:top w:type="dxa" w:w="60"/>
+              <w:left w:type="dxa" w:w="100"/>
+              <w:bottom w:type="dxa" w:w="60"/>
+              <w:right w:type="dxa" w:w="100"/>
+            </w:tcMar>
+          </w:tcPr>
+          <w:p>
+            <w:r>
+              <w:rPr>
+                <w:rFonts w:ascii="Calibri" w:cs="Calibri" w:eastAsia="Calibri" w:hAnsi="Calibri"/>
+                <w:sz w:val="18"/>
+                <w:szCs w:val="18"/>
+              </w:rPr>
+              <w:t xml:space="preserve">"Section 11, Scope &amp; Time-Box: is authentication / authorization something simple we can do easily? If so, let's do it, then add it to all our docx documents."</w:t>
+            </w:r>
+          </w:p>
+        </w:tc>
+      </w:tr>
+      <w:tr>
+        <w:tc>
+          <w:tcPr>
+            <w:tcW w:type="dxa" w:w="1482"/>
+            <w:tcBorders>
+              <w:top w:val="single" w:color="BFBFBF" w:sz="4"/>
+              <w:left w:val="single" w:color="BFBFBF" w:sz="4"/>
+              <w:bottom w:val="single" w:color="BFBFBF" w:sz="4"/>
+              <w:right w:val="single" w:color="BFBFBF" w:sz="4"/>
+            </w:tcBorders>
+            <w:tcMar>
+              <w:top w:type="dxa" w:w="60"/>
+              <w:left w:type="dxa" w:w="100"/>
+              <w:bottom w:type="dxa" w:w="60"/>
+              <w:right w:type="dxa" w:w="100"/>
+            </w:tcMar>
+          </w:tcPr>
+          <w:p>
+            <w:r>
+              <w:rPr>
+                <w:rFonts w:ascii="Calibri" w:cs="Calibri" w:eastAsia="Calibri" w:hAnsi="Calibri"/>
+                <w:sz w:val="18"/>
+                <w:szCs w:val="18"/>
+              </w:rPr>
+              <w:t xml:space="preserve">17</w:t>
+            </w:r>
+          </w:p>
+        </w:tc>
+        <w:tc>
+          <w:tcPr>
+            <w:tcW w:type="dxa" w:w="2224"/>
+            <w:tcBorders>
+              <w:top w:val="single" w:color="BFBFBF" w:sz="4"/>
+              <w:left w:val="single" w:color="BFBFBF" w:sz="4"/>
+              <w:bottom w:val="single" w:color="BFBFBF" w:sz="4"/>
+              <w:right w:val="single" w:color="BFBFBF" w:sz="4"/>
+            </w:tcBorders>
+            <w:tcMar>
+              <w:top w:type="dxa" w:w="60"/>
+              <w:left w:type="dxa" w:w="100"/>
+              <w:bottom w:type="dxa" w:w="60"/>
+              <w:right w:type="dxa" w:w="100"/>
+            </w:tcMar>
+          </w:tcPr>
+          <w:p>
+            <w:r>
+              <w:rPr>
+                <w:rFonts w:ascii="Calibri" w:cs="Calibri" w:eastAsia="Calibri" w:hAnsi="Calibri"/>
+                <w:sz w:val="18"/>
+                <w:szCs w:val="18"/>
+              </w:rPr>
+              <w:t xml:space="preserve">Scope</w:t>
+            </w:r>
+          </w:p>
+        </w:tc>
+        <w:tc>
+          <w:tcPr>
+            <w:tcW w:type="dxa" w:w="5932"/>
+            <w:tcBorders>
+              <w:top w:val="single" w:color="BFBFBF" w:sz="4"/>
+              <w:left w:val="single" w:color="BFBFBF" w:sz="4"/>
+              <w:bottom w:val="single" w:color="BFBFBF" w:sz="4"/>
+              <w:right w:val="single" w:color="BFBFBF" w:sz="4"/>
+            </w:tcBorders>
+            <w:tcMar>
+              <w:top w:type="dxa" w:w="60"/>
+              <w:left w:type="dxa" w:w="100"/>
+              <w:bottom w:type="dxa" w:w="60"/>
+              <w:right w:type="dxa" w:w="100"/>
+            </w:tcMar>
+          </w:tcPr>
+          <w:p>
+            <w:r>
+              <w:rPr>
+                <w:rFonts w:ascii="Calibri" w:cs="Calibri" w:eastAsia="Calibri" w:hAnsi="Calibri"/>
+                <w:sz w:val="18"/>
+                <w:szCs w:val="18"/>
+              </w:rPr>
+              <w:t xml:space="preserve">"I see, this is too complex; I'm afraid the reviewer will get confused. I'm cancelling authentication: roll the code back. Let's not look for adventures. Another task I do think we should do: a simple UI in Angular 17 that shows the objects and wraps the REST API commands."</w:t>
+            </w:r>
+          </w:p>
+        </w:tc>
+      </w:tr>
     </w:tbl>
     <w:p>
       <w:pPr>
@@ -7060,7 +7444,438 @@
                 <w:sz w:val="18"/>
                 <w:szCs w:val="18"/>
               </w:rPr>
-              <w:t xml:space="preserve">All 31 commits authored by me</w:t>
+              <w:t xml:space="preserve">All commits authored by me</w:t>
+            </w:r>
+          </w:p>
+        </w:tc>
+      </w:tr>
+      <w:tr>
+        <w:tc>
+          <w:tcPr>
+            <w:tcW w:type="dxa" w:w="741"/>
+            <w:tcBorders>
+              <w:top w:val="single" w:color="BFBFBF" w:sz="4"/>
+              <w:left w:val="single" w:color="BFBFBF" w:sz="4"/>
+              <w:bottom w:val="single" w:color="BFBFBF" w:sz="4"/>
+              <w:right w:val="single" w:color="BFBFBF" w:sz="4"/>
+            </w:tcBorders>
+            <w:tcMar>
+              <w:top w:type="dxa" w:w="60"/>
+              <w:left w:type="dxa" w:w="100"/>
+              <w:bottom w:type="dxa" w:w="60"/>
+              <w:right w:type="dxa" w:w="100"/>
+            </w:tcMar>
+          </w:tcPr>
+          <w:p>
+            <w:r>
+              <w:rPr>
+                <w:rFonts w:ascii="Calibri" w:cs="Calibri" w:eastAsia="Calibri" w:hAnsi="Calibri"/>
+                <w:sz w:val="18"/>
+                <w:szCs w:val="18"/>
+              </w:rPr>
+              <w:t xml:space="preserve">15</w:t>
+            </w:r>
+          </w:p>
+        </w:tc>
+        <w:tc>
+          <w:tcPr>
+            <w:tcW w:type="dxa" w:w="2965"/>
+            <w:tcBorders>
+              <w:top w:val="single" w:color="BFBFBF" w:sz="4"/>
+              <w:left w:val="single" w:color="BFBFBF" w:sz="4"/>
+              <w:bottom w:val="single" w:color="BFBFBF" w:sz="4"/>
+              <w:right w:val="single" w:color="BFBFBF" w:sz="4"/>
+            </w:tcBorders>
+            <w:tcMar>
+              <w:top w:type="dxa" w:w="60"/>
+              <w:left w:type="dxa" w:w="100"/>
+              <w:bottom w:type="dxa" w:w="60"/>
+              <w:right w:type="dxa" w:w="100"/>
+            </w:tcMar>
+          </w:tcPr>
+          <w:p>
+            <w:r>
+              <w:rPr>
+                <w:rFonts w:ascii="Calibri" w:cs="Calibri" w:eastAsia="Calibri" w:hAnsi="Calibri"/>
+                <w:b/>
+                <w:bCs/>
+                <w:sz w:val="18"/>
+                <w:szCs w:val="18"/>
+              </w:rPr>
+              <w:t xml:space="preserve">Authentication / authorization</w:t>
+            </w:r>
+            <w:r>
+              <w:rPr>
+                <w:rFonts w:ascii="Calibri" w:cs="Calibri" w:eastAsia="Calibri" w:hAnsi="Calibri"/>
+                <w:sz w:val="18"/>
+                <w:szCs w:val="18"/>
+              </w:rPr>
+              <w:t xml:space="preserve"> (API keys, roles reader / operator, service identities, 32 tests), which I had asked for</w:t>
+            </w:r>
+          </w:p>
+        </w:tc>
+        <w:tc>
+          <w:tcPr>
+            <w:tcW w:type="dxa" w:w="2965"/>
+            <w:tcBorders>
+              <w:top w:val="single" w:color="BFBFBF" w:sz="4"/>
+              <w:left w:val="single" w:color="BFBFBF" w:sz="4"/>
+              <w:bottom w:val="single" w:color="BFBFBF" w:sz="4"/>
+              <w:right w:val="single" w:color="BFBFBF" w:sz="4"/>
+            </w:tcBorders>
+            <w:tcMar>
+              <w:top w:type="dxa" w:w="60"/>
+              <w:left w:type="dxa" w:w="100"/>
+              <w:bottom w:type="dxa" w:w="60"/>
+              <w:right w:type="dxa" w:w="100"/>
+            </w:tcMar>
+          </w:tcPr>
+          <w:p>
+            <w:r>
+              <w:rPr>
+                <w:rFonts w:ascii="Calibri" w:cs="Calibri" w:eastAsia="Calibri" w:hAnsi="Calibri"/>
+                <w:b/>
+                <w:bCs/>
+                <w:sz w:val="18"/>
+                <w:szCs w:val="18"/>
+              </w:rPr>
+              <w:t xml:space="preserve">Rolled back by my decision.</w:t>
+            </w:r>
+            <w:r>
+              <w:rPr>
+                <w:rFonts w:ascii="Calibri" w:cs="Calibri" w:eastAsia="Calibri" w:hAnsi="Calibri"/>
+                <w:sz w:val="18"/>
+                <w:szCs w:val="18"/>
+              </w:rPr>
+              <w:t xml:space="preserve"> It is explicitly not required, and every caller (reviewer, Postman, scripts, UI, tests) would have needed keys, so the solution would have been harder to run and review</w:t>
+            </w:r>
+          </w:p>
+        </w:tc>
+        <w:tc>
+          <w:tcPr>
+            <w:tcW w:type="dxa" w:w="2967"/>
+            <w:tcBorders>
+              <w:top w:val="single" w:color="BFBFBF" w:sz="4"/>
+              <w:left w:val="single" w:color="BFBFBF" w:sz="4"/>
+              <w:bottom w:val="single" w:color="BFBFBF" w:sz="4"/>
+              <w:right w:val="single" w:color="BFBFBF" w:sz="4"/>
+            </w:tcBorders>
+            <w:tcMar>
+              <w:top w:type="dxa" w:w="60"/>
+              <w:left w:type="dxa" w:w="100"/>
+              <w:bottom w:type="dxa" w:w="60"/>
+              <w:right w:type="dxa" w:w="100"/>
+            </w:tcMar>
+          </w:tcPr>
+          <w:p>
+            <w:r>
+              <w:rPr>
+                <w:rFonts w:ascii="Calibri" w:cs="Calibri" w:eastAsia="Calibri" w:hAnsi="Calibri"/>
+                <w:sz w:val="18"/>
+                <w:szCs w:val="18"/>
+              </w:rPr>
+              <w:t xml:space="preserve">Reverted (history kept); documented as a limitation with a production plan (D29, SE-1)</w:t>
+            </w:r>
+          </w:p>
+        </w:tc>
+      </w:tr>
+      <w:tr>
+        <w:tc>
+          <w:tcPr>
+            <w:tcW w:type="dxa" w:w="741"/>
+            <w:tcBorders>
+              <w:top w:val="single" w:color="BFBFBF" w:sz="4"/>
+              <w:left w:val="single" w:color="BFBFBF" w:sz="4"/>
+              <w:bottom w:val="single" w:color="BFBFBF" w:sz="4"/>
+              <w:right w:val="single" w:color="BFBFBF" w:sz="4"/>
+            </w:tcBorders>
+            <w:tcMar>
+              <w:top w:type="dxa" w:w="60"/>
+              <w:left w:type="dxa" w:w="100"/>
+              <w:bottom w:type="dxa" w:w="60"/>
+              <w:right w:type="dxa" w:w="100"/>
+            </w:tcMar>
+          </w:tcPr>
+          <w:p>
+            <w:r>
+              <w:rPr>
+                <w:rFonts w:ascii="Calibri" w:cs="Calibri" w:eastAsia="Calibri" w:hAnsi="Calibri"/>
+                <w:sz w:val="18"/>
+                <w:szCs w:val="18"/>
+              </w:rPr>
+              <w:t xml:space="preserve">16</w:t>
+            </w:r>
+          </w:p>
+        </w:tc>
+        <w:tc>
+          <w:tcPr>
+            <w:tcW w:type="dxa" w:w="2965"/>
+            <w:tcBorders>
+              <w:top w:val="single" w:color="BFBFBF" w:sz="4"/>
+              <w:left w:val="single" w:color="BFBFBF" w:sz="4"/>
+              <w:bottom w:val="single" w:color="BFBFBF" w:sz="4"/>
+              <w:right w:val="single" w:color="BFBFBF" w:sz="4"/>
+            </w:tcBorders>
+            <w:tcMar>
+              <w:top w:type="dxa" w:w="60"/>
+              <w:left w:type="dxa" w:w="100"/>
+              <w:bottom w:type="dxa" w:w="60"/>
+              <w:right w:type="dxa" w:w="100"/>
+            </w:tcMar>
+          </w:tcPr>
+          <w:p>
+            <w:r>
+              <w:rPr>
+                <w:rFonts w:ascii="Calibri" w:cs="Calibri" w:eastAsia="Calibri" w:hAnsi="Calibri"/>
+                <w:b/>
+                <w:bCs/>
+                <w:sz w:val="18"/>
+                <w:szCs w:val="18"/>
+              </w:rPr>
+              <w:t xml:space="preserve">The latest supported Angular</w:t>
+            </w:r>
+            <w:r>
+              <w:rPr>
+                <w:rFonts w:ascii="Calibri" w:cs="Calibri" w:eastAsia="Calibri" w:hAnsi="Calibri"/>
+                <w:sz w:val="18"/>
+                <w:szCs w:val="18"/>
+              </w:rPr>
+              <w:t xml:space="preserve"> for the UI</w:t>
+            </w:r>
+          </w:p>
+        </w:tc>
+        <w:tc>
+          <w:tcPr>
+            <w:tcW w:type="dxa" w:w="2965"/>
+            <w:tcBorders>
+              <w:top w:val="single" w:color="BFBFBF" w:sz="4"/>
+              <w:left w:val="single" w:color="BFBFBF" w:sz="4"/>
+              <w:bottom w:val="single" w:color="BFBFBF" w:sz="4"/>
+              <w:right w:val="single" w:color="BFBFBF" w:sz="4"/>
+            </w:tcBorders>
+            <w:tcMar>
+              <w:top w:type="dxa" w:w="60"/>
+              <w:left w:type="dxa" w:w="100"/>
+              <w:bottom w:type="dxa" w:w="60"/>
+              <w:right w:type="dxa" w:w="100"/>
+            </w:tcMar>
+          </w:tcPr>
+          <w:p>
+            <w:r>
+              <w:rPr>
+                <w:rFonts w:ascii="Calibri" w:cs="Calibri" w:eastAsia="Calibri" w:hAnsi="Calibri"/>
+                <w:b/>
+                <w:bCs/>
+                <w:sz w:val="18"/>
+                <w:szCs w:val="18"/>
+              </w:rPr>
+              <w:t xml:space="preserve">Changed:</w:t>
+            </w:r>
+            <w:r>
+              <w:rPr>
+                <w:rFonts w:ascii="Calibri" w:cs="Calibri" w:eastAsia="Calibri" w:hAnsi="Calibri"/>
+                <w:sz w:val="18"/>
+                <w:szCs w:val="18"/>
+              </w:rPr>
+              <w:t xml:space="preserve"> I chose Angular 17, which I know, accepting that it is past official support</w:t>
+            </w:r>
+          </w:p>
+        </w:tc>
+        <w:tc>
+          <w:tcPr>
+            <w:tcW w:type="dxa" w:w="2967"/>
+            <w:tcBorders>
+              <w:top w:val="single" w:color="BFBFBF" w:sz="4"/>
+              <w:left w:val="single" w:color="BFBFBF" w:sz="4"/>
+              <w:bottom w:val="single" w:color="BFBFBF" w:sz="4"/>
+              <w:right w:val="single" w:color="BFBFBF" w:sz="4"/>
+            </w:tcBorders>
+            <w:tcMar>
+              <w:top w:type="dxa" w:w="60"/>
+              <w:left w:type="dxa" w:w="100"/>
+              <w:bottom w:type="dxa" w:w="60"/>
+              <w:right w:type="dxa" w:w="100"/>
+            </w:tcMar>
+          </w:tcPr>
+          <w:p>
+            <w:r>
+              <w:rPr>
+                <w:rFonts w:ascii="Calibri" w:cs="Calibri" w:eastAsia="Calibri" w:hAnsi="Calibri"/>
+                <w:sz w:val="18"/>
+                <w:szCs w:val="18"/>
+              </w:rPr>
+              <w:t xml:space="preserve">Angular 17; upgrade listed as limitation UI-1 (D28)</w:t>
+            </w:r>
+          </w:p>
+        </w:tc>
+      </w:tr>
+      <w:tr>
+        <w:tc>
+          <w:tcPr>
+            <w:tcW w:type="dxa" w:w="741"/>
+            <w:tcBorders>
+              <w:top w:val="single" w:color="BFBFBF" w:sz="4"/>
+              <w:left w:val="single" w:color="BFBFBF" w:sz="4"/>
+              <w:bottom w:val="single" w:color="BFBFBF" w:sz="4"/>
+              <w:right w:val="single" w:color="BFBFBF" w:sz="4"/>
+            </w:tcBorders>
+            <w:tcMar>
+              <w:top w:type="dxa" w:w="60"/>
+              <w:left w:type="dxa" w:w="100"/>
+              <w:bottom w:type="dxa" w:w="60"/>
+              <w:right w:type="dxa" w:w="100"/>
+            </w:tcMar>
+          </w:tcPr>
+          <w:p>
+            <w:r>
+              <w:rPr>
+                <w:rFonts w:ascii="Calibri" w:cs="Calibri" w:eastAsia="Calibri" w:hAnsi="Calibri"/>
+                <w:sz w:val="18"/>
+                <w:szCs w:val="18"/>
+              </w:rPr>
+              <w:t xml:space="preserve">17</w:t>
+            </w:r>
+          </w:p>
+        </w:tc>
+        <w:tc>
+          <w:tcPr>
+            <w:tcW w:type="dxa" w:w="2965"/>
+            <w:tcBorders>
+              <w:top w:val="single" w:color="BFBFBF" w:sz="4"/>
+              <w:left w:val="single" w:color="BFBFBF" w:sz="4"/>
+              <w:bottom w:val="single" w:color="BFBFBF" w:sz="4"/>
+              <w:right w:val="single" w:color="BFBFBF" w:sz="4"/>
+            </w:tcBorders>
+            <w:tcMar>
+              <w:top w:type="dxa" w:w="60"/>
+              <w:left w:type="dxa" w:w="100"/>
+              <w:bottom w:type="dxa" w:w="60"/>
+              <w:right w:type="dxa" w:w="100"/>
+            </w:tcMar>
+          </w:tcPr>
+          <w:p>
+            <w:r>
+              <w:rPr>
+                <w:rFonts w:ascii="Calibri" w:cs="Calibri" w:eastAsia="Calibri" w:hAnsi="Calibri"/>
+                <w:sz w:val="18"/>
+                <w:szCs w:val="18"/>
+              </w:rPr>
+              <w:t xml:space="preserve">The UI's Docker build: first </w:t>
+            </w:r>
+            <w:r>
+              <w:rPr>
+                <w:rFonts w:ascii="Consolas" w:cs="Consolas" w:eastAsia="Consolas" w:hAnsi="Consolas"/>
+                <w:color w:val="5B2C6F"/>
+                <w:sz w:val="16"/>
+                <w:szCs w:val="16"/>
+              </w:rPr>
+              <w:t xml:space="preserve">npx ng build</w:t>
+            </w:r>
+            <w:r>
+              <w:rPr>
+                <w:rFonts w:ascii="Calibri" w:cs="Calibri" w:eastAsia="Calibri" w:hAnsi="Calibri"/>
+                <w:sz w:val="18"/>
+                <w:szCs w:val="18"/>
+              </w:rPr>
+              <w:t xml:space="preserve"> (tried to download a package called </w:t>
+            </w:r>
+            <w:r>
+              <w:rPr>
+                <w:rFonts w:ascii="Consolas" w:cs="Consolas" w:eastAsia="Consolas" w:hAnsi="Consolas"/>
+                <w:color w:val="5B2C6F"/>
+                <w:sz w:val="16"/>
+                <w:szCs w:val="16"/>
+              </w:rPr>
+              <w:t xml:space="preserve">ng</w:t>
+            </w:r>
+            <w:r>
+              <w:rPr>
+                <w:rFonts w:ascii="Calibri" w:cs="Calibri" w:eastAsia="Calibri" w:hAnsi="Calibri"/>
+                <w:sz w:val="18"/>
+                <w:szCs w:val="18"/>
+              </w:rPr>
+              <w:t xml:space="preserve">), then npm inside Docker and on my machine, both blocked by my network's TLS inspection</w:t>
+            </w:r>
+          </w:p>
+        </w:tc>
+        <w:tc>
+          <w:tcPr>
+            <w:tcW w:type="dxa" w:w="2965"/>
+            <w:tcBorders>
+              <w:top w:val="single" w:color="BFBFBF" w:sz="4"/>
+              <w:left w:val="single" w:color="BFBFBF" w:sz="4"/>
+              <w:bottom w:val="single" w:color="BFBFBF" w:sz="4"/>
+              <w:right w:val="single" w:color="BFBFBF" w:sz="4"/>
+            </w:tcBorders>
+            <w:tcMar>
+              <w:top w:type="dxa" w:w="60"/>
+              <w:left w:type="dxa" w:w="100"/>
+              <w:bottom w:type="dxa" w:w="60"/>
+              <w:right w:type="dxa" w:w="100"/>
+            </w:tcMar>
+          </w:tcPr>
+          <w:p>
+            <w:r>
+              <w:rPr>
+                <w:rFonts w:ascii="Calibri" w:cs="Calibri" w:eastAsia="Calibri" w:hAnsi="Calibri"/>
+                <w:b/>
+                <w:bCs/>
+                <w:sz w:val="18"/>
+                <w:szCs w:val="18"/>
+              </w:rPr>
+              <w:t xml:space="preserve">Corrected by running it.</w:t>
+            </w:r>
+            <w:r>
+              <w:rPr>
+                <w:rFonts w:ascii="Calibri" w:cs="Calibri" w:eastAsia="Calibri" w:hAnsi="Calibri"/>
+                <w:sz w:val="18"/>
+                <w:szCs w:val="18"/>
+              </w:rPr>
+              <w:t xml:space="preserve"> The build now calls the local CLI and checks the install; for blocked networks the AI built the UI in its environment and we committed the output (</w:t>
+            </w:r>
+            <w:r>
+              <w:rPr>
+                <w:rFonts w:ascii="Consolas" w:cs="Consolas" w:eastAsia="Consolas" w:hAnsi="Consolas"/>
+                <w:color w:val="5B2C6F"/>
+                <w:sz w:val="16"/>
+                <w:szCs w:val="16"/>
+              </w:rPr>
+              <w:t xml:space="preserve">ui/prebuilt</w:t>
+            </w:r>
+            <w:r>
+              <w:rPr>
+                <w:rFonts w:ascii="Calibri" w:cs="Calibri" w:eastAsia="Calibri" w:hAnsi="Calibri"/>
+                <w:sz w:val="18"/>
+                <w:szCs w:val="18"/>
+              </w:rPr>
+              <w:t xml:space="preserve">), which the prebuilt Docker path packages without npm</w:t>
+            </w:r>
+          </w:p>
+        </w:tc>
+        <w:tc>
+          <w:tcPr>
+            <w:tcW w:type="dxa" w:w="2967"/>
+            <w:tcBorders>
+              <w:top w:val="single" w:color="BFBFBF" w:sz="4"/>
+              <w:left w:val="single" w:color="BFBFBF" w:sz="4"/>
+              <w:bottom w:val="single" w:color="BFBFBF" w:sz="4"/>
+              <w:right w:val="single" w:color="BFBFBF" w:sz="4"/>
+            </w:tcBorders>
+            <w:tcMar>
+              <w:top w:type="dxa" w:w="60"/>
+              <w:left w:type="dxa" w:w="100"/>
+              <w:bottom w:type="dxa" w:w="60"/>
+              <w:right w:type="dxa" w:w="100"/>
+            </w:tcMar>
+          </w:tcPr>
+          <w:p>
+            <w:r>
+              <w:rPr>
+                <w:rFonts w:ascii="Calibri" w:cs="Calibri" w:eastAsia="Calibri" w:hAnsi="Calibri"/>
+                <w:sz w:val="18"/>
+                <w:szCs w:val="18"/>
+              </w:rPr>
+              <w:t xml:space="preserve">D-08 fixed; trade-off documented (UI-3)</w:t>
             </w:r>
           </w:p>
         </w:tc>
@@ -7129,7 +7944,7 @@
         <w:rPr>
           <w:rFonts w:ascii="Calibri" w:cs="Calibri" w:eastAsia="Calibri" w:hAnsi="Calibri"/>
         </w:rPr>
-        <w:t xml:space="preserve">, not from the first draft: 7 of the 14 items above were found by tests or by running the system.</w:t>
+        <w:t xml:space="preserve">, not from the first draft: 8 of the 17 items above were found by tests or by running the system.</w:t>
       </w:r>
     </w:p>
     <w:p>
@@ -7198,7 +8013,30 @@
         <w:rPr>
           <w:rFonts w:ascii="Calibri" w:cs="Calibri" w:eastAsia="Calibri" w:hAnsi="Calibri"/>
         </w:rPr>
-        <w:t xml:space="preserve"> The AI's recommendations were often good, and I accepted most of them, but some were driven by its own constraints (#1) or would have put company material into the repository (#8). Recording every decision (D1–D27) made it possible to explain and defend each one.</w:t>
+        <w:t xml:space="preserve"> The AI's recommendations were often good, and I accepted most of them, but some were driven by its own constraints (#1) or would have put company material into the repository (#8). Recording every decision (D1–D29) made it possible to explain and defend each one.</w:t>
+      </w:r>
+    </w:p>
+    <w:p>
+      <w:pPr>
+        <w:pStyle w:val="ListParagraph"/>
+        <w:numPr>
+          <w:ilvl w:val="0"/>
+          <w:numId w:val="2"/>
+        </w:numPr>
+      </w:pPr>
+      <w:r>
+        <w:rPr>
+          <w:rFonts w:ascii="Calibri" w:cs="Calibri" w:eastAsia="Calibri" w:hAnsi="Calibri"/>
+          <w:b/>
+          <w:bCs/>
+        </w:rPr>
+        <w:t xml:space="preserve">Doing less can be the better decision.</w:t>
+      </w:r>
+      <w:r>
+        <w:rPr>
+          <w:rFonts w:ascii="Calibri" w:cs="Calibri" w:eastAsia="Calibri" w:hAnsi="Calibri"/>
+        </w:rPr>
+        <w:t xml:space="preserve"> Authentication worked and was tested, but it made the solution harder to run and review for an optional feature. Rolling it back (#15) was a scope decision, not a technical one.</w:t>
       </w:r>
     </w:p>
     <w:p>

</xml_diff>